<commit_message>
v1.6: full Agreement (MOU) as one working-draft tab with pending items highlighted on page, PDF, and Word; retire the two commitment tabs; counsel commitments list; plan placeholders highlighted
Co-Authored-By: Claude Opus 5.5 <noreply@anthropic.com>
</commit_message>
<xml_diff>
--- a/downloads/chss-data-security-privacy-plan.docx
+++ b/downloads/chss-data-security-privacy-plan.docx
@@ -15,7 +15,7 @@
         <w:rPr>
           <w:i/>
         </w:rPr>
-        <w:t>Draft v1.5 · Oct 29, 2026 · Center for High School Success · for discussion; not legal advice</w:t>
+        <w:t>Draft v1.6 · Oct 29, 2026 · Center for High School Success · for discussion; not legal advice</w:t>
       </w:r>
     </w:p>
     <w:p>
@@ -26,7 +26,34 @@
         <w:t>Center for High School Success, a program of Stand for Children Leadership Center, Inc.</w:t>
       </w:r>
       <w:r>
-        <w:t xml:space="preserve"> Effective date: [date] · Owner: [name], Privacy Officer · Reviewed annually · Published at: [CHSS URL]</w:t>
+        <w:t xml:space="preserve"> Effective date: </w:t>
+      </w:r>
+      <w:r>
+        <w:rPr>
+          <w:b/>
+          <w:highlight w:val="yellow"/>
+        </w:rPr>
+        <w:t>Pending: effective date</w:t>
+      </w:r>
+      <w:r>
+        <w:t xml:space="preserve"> · Owner: </w:t>
+      </w:r>
+      <w:r>
+        <w:rPr>
+          <w:b/>
+          <w:highlight w:val="yellow"/>
+        </w:rPr>
+        <w:t>Pending, Jonah: Privacy Officer name (O8)</w:t>
+      </w:r>
+      <w:r>
+        <w:t xml:space="preserve"> · Reviewed annually · Published at: </w:t>
+      </w:r>
+      <w:r>
+        <w:rPr>
+          <w:b/>
+          <w:highlight w:val="yellow"/>
+        </w:rPr>
+        <w:t>Pending, Emily: CHSS URL (O18)</w:t>
       </w:r>
     </w:p>
     <w:p>
@@ -130,7 +157,14 @@
         <w:t>Security framework.</w:t>
       </w:r>
       <w:r>
-        <w:t xml:space="preserve"> CHSS aligns its security program with the NIST Cybersecurity Framework. [Confirm, Decisions O20.]</w:t>
+        <w:t xml:space="preserve"> CHSS aligns its security program with the NIST Cybersecurity Framework. </w:t>
+      </w:r>
+      <w:r>
+        <w:rPr>
+          <w:b/>
+          <w:highlight w:val="yellow"/>
+        </w:rPr>
+        <w:t>Pending, Emily: confirm NIST CSF alignment (O20)</w:t>
       </w:r>
     </w:p>
     <w:p>
@@ -141,7 +175,27 @@
         <w:t>Accountability.</w:t>
       </w:r>
       <w:r>
-        <w:t xml:space="preserve"> CHSS designates a Privacy Officer, [name, title, email], responsible for this plan and for compliance with each LEA agreement, and a Security Officer, [name, title, email], responsible for the security program. The Privacy Officer reviews this plan at least annually and whenever CHSS's services, subprocessors, or applicable law change materially, and CHSS notifies LEAs of material changes.</w:t>
+        <w:t xml:space="preserve"> CHSS designates a Privacy Officer, </w:t>
+      </w:r>
+      <w:r>
+        <w:rPr>
+          <w:b/>
+          <w:highlight w:val="yellow"/>
+        </w:rPr>
+        <w:t>Pending, Jonah: name, title, email (O8)</w:t>
+      </w:r>
+      <w:r>
+        <w:t xml:space="preserve">, responsible for this plan and for compliance with each LEA agreement, and a Security Officer, </w:t>
+      </w:r>
+      <w:r>
+        <w:rPr>
+          <w:b/>
+          <w:highlight w:val="yellow"/>
+        </w:rPr>
+        <w:t>Pending, Emily: name, title, email</w:t>
+      </w:r>
+      <w:r>
+        <w:t>, responsible for the security program. The Privacy Officer reviews this plan at least annually and whenever CHSS's services, subprocessors, or applicable law change materially, and CHSS notifies LEAs of material changes.</w:t>
       </w:r>
     </w:p>
     <w:p>
@@ -173,7 +227,14 @@
         <w:pStyle w:val="ListBullet"/>
       </w:pPr>
       <w:r>
-        <w:t>Every CHSS employee with access to student data passes a criminal background check before access is granted, signs a confidentiality agreement, and completes the training described in Section 5. [Confirm, Decisions O5.]</w:t>
+        <w:t xml:space="preserve">Every CHSS employee with access to student data passes a criminal background check before access is granted, signs a confidentiality agreement, and completes the training described in Section 5. </w:t>
+      </w:r>
+      <w:r>
+        <w:rPr>
+          <w:b/>
+          <w:highlight w:val="yellow"/>
+        </w:rPr>
+        <w:t>Pending, Demian and James: confirm current practice (O5)</w:t>
       </w:r>
     </w:p>
     <w:p>
@@ -189,7 +250,14 @@
         <w:pStyle w:val="ListBullet"/>
       </w:pPr>
       <w:r>
-        <w:t>CHSS completes an independent assessment of its security controls (SOC 2 Type II or equivalent) and a penetration test of the platform at least annually. [First assessment completion date.]</w:t>
+        <w:t xml:space="preserve">CHSS completes an independent assessment of its security controls (SOC 2 Type II or equivalent) and a penetration test of the platform at least annually. </w:t>
+      </w:r>
+      <w:r>
+        <w:rPr>
+          <w:b/>
+          <w:highlight w:val="yellow"/>
+        </w:rPr>
+        <w:t>Pending, Emily: first assessment completion date (O4)</w:t>
       </w:r>
     </w:p>
     <w:p>
@@ -298,7 +366,17 @@
     </w:p>
     <w:p>
       <w:r>
-        <w:t>All student data is stored and processed in data centers located in the United States, operated by the subprocessors listed in Section 6. [Confirm U.S. region for each tenant, Decisions O14.] Data is encrypted in transit using TLS 1.2 or higher and at rest using AES-256 or equivalent, including in backups and in the file-transfer landing area.</w:t>
+        <w:t xml:space="preserve">All student data is stored and processed in data centers located in the United States, operated by the subprocessors listed in Section 6. </w:t>
+      </w:r>
+      <w:r>
+        <w:rPr>
+          <w:b/>
+          <w:highlight w:val="yellow"/>
+        </w:rPr>
+        <w:t>Pending, Emily: confirm U.S. region for each service (O14)</w:t>
+      </w:r>
+      <w:r>
+        <w:t xml:space="preserve"> Data is encrypted in transit using TLS 1.2 or higher and at rest using AES-256 or equivalent, including in backups and in the file-transfer landing area.</w:t>
       </w:r>
     </w:p>
     <w:p>
@@ -507,7 +585,11 @@
           <w:p>
             <w:r/>
             <w:r>
-              <w:t>[AI model provider]</w:t>
+              <w:rPr>
+                <w:b/>
+                <w:highlight w:val="yellow"/>
+              </w:rPr>
+              <w:t>Pending, Emily: AI model provider (O3)</w:t>
             </w:r>
           </w:p>
         </w:tc>
@@ -888,7 +970,27 @@
     </w:p>
     <w:p>
       <w:r>
-        <w:t>Questions about this plan, requests from an LEA, and incident reports go to the CHSS Privacy Officer, [name], at [privacy@ mailbox] or [phone]. Security matters may also be sent to the Security Officer, [name], at [email].</w:t>
+        <w:t xml:space="preserve">Questions about this plan, requests from an LEA, and incident reports go to the CHSS Privacy Officer, </w:t>
+      </w:r>
+      <w:r>
+        <w:rPr>
+          <w:b/>
+          <w:highlight w:val="yellow"/>
+        </w:rPr>
+        <w:t>Pending: name, privacy@ mailbox, phone</w:t>
+      </w:r>
+      <w:r>
+        <w:t xml:space="preserve">. Security matters may also be sent to the Security Officer, </w:t>
+      </w:r>
+      <w:r>
+        <w:rPr>
+          <w:b/>
+          <w:highlight w:val="yellow"/>
+        </w:rPr>
+        <w:t>Pending: name and email</w:t>
+      </w:r>
+      <w:r>
+        <w:t>.</w:t>
       </w:r>
     </w:p>
     <w:sectPr>

</xml_diff>